<commit_message>
Create analysis and justification of different methodologies. Small update to Project Outline.
</commit_message>
<xml_diff>
--- a/docs/00_Project-Outline/ets6_ProjectOutline.docx
+++ b/docs/00_Project-Outline/ets6_ProjectOutline.docx
@@ -460,21 +460,7 @@
         <w:rPr>
           <w:rFonts w:ascii="Times New Roman" w:hAnsi="Times New Roman" w:cs="Times New Roman"/>
         </w:rPr>
-        <w:t xml:space="preserve">system will implement a geographical validation mechanism to ensure the restaurant only receives orders they can </w:t>
-      </w:r>
-      <w:proofErr w:type="gramStart"/>
-      <w:r>
-        <w:rPr>
-          <w:rFonts w:ascii="Times New Roman" w:hAnsi="Times New Roman" w:cs="Times New Roman"/>
-        </w:rPr>
-        <w:t>actually fulfil</w:t>
-      </w:r>
-      <w:proofErr w:type="gramEnd"/>
-      <w:r>
-        <w:rPr>
-          <w:rFonts w:ascii="Times New Roman" w:hAnsi="Times New Roman" w:cs="Times New Roman"/>
-        </w:rPr>
-        <w:t>.</w:t>
+        <w:t>system will implement a geographical validation mechanism to ensure the restaurant only receives orders they can actually fulfil.</w:t>
       </w:r>
     </w:p>
     <w:p>
@@ -972,21 +958,7 @@
         <w:rPr>
           <w:rFonts w:ascii="Times New Roman" w:hAnsi="Times New Roman" w:cs="Times New Roman"/>
         </w:rPr>
-        <w:t xml:space="preserve">will be kept </w:t>
-      </w:r>
-      <w:proofErr w:type="gramStart"/>
-      <w:r>
-        <w:rPr>
-          <w:rFonts w:ascii="Times New Roman" w:hAnsi="Times New Roman" w:cs="Times New Roman"/>
-        </w:rPr>
-        <w:t>to record</w:t>
-      </w:r>
-      <w:proofErr w:type="gramEnd"/>
-      <w:r>
-        <w:rPr>
-          <w:rFonts w:ascii="Times New Roman" w:hAnsi="Times New Roman" w:cs="Times New Roman"/>
-        </w:rPr>
-        <w:t xml:space="preserve"> design decisions, problems encountered, and their solutions. </w:t>
+        <w:t xml:space="preserve">will be kept to record design decisions, problems encountered, and their solutions. </w:t>
       </w:r>
       <w:r>
         <w:rPr>
@@ -2818,26 +2790,18 @@
     </w:p>
     <w:p>
       <w:pPr>
-        <w:rPr>
-          <w:rFonts w:ascii="Times New Roman" w:hAnsi="Times New Roman" w:cs="Times New Roman"/>
-        </w:rPr>
-      </w:pPr>
-    </w:p>
-    <w:p>
-      <w:pPr>
         <w:pStyle w:val="Heading1"/>
         <w:rPr>
           <w:rFonts w:ascii="Times New Roman" w:hAnsi="Times New Roman" w:cs="Times New Roman"/>
         </w:rPr>
       </w:pPr>
-      <w:bookmarkStart w:id="6" w:name="_Toc220756723"/>
-      <w:r>
-        <w:rPr>
-          <w:rFonts w:ascii="Times New Roman" w:hAnsi="Times New Roman" w:cs="Times New Roman"/>
-        </w:rPr>
-        <w:t>Initial Annotated Bibliography</w:t>
-      </w:r>
-      <w:bookmarkEnd w:id="6"/>
+      <w:r>
+        <w:rPr>
+          <w:rFonts w:ascii="Times New Roman" w:hAnsi="Times New Roman" w:cs="Times New Roman"/>
+        </w:rPr>
+        <w:lastRenderedPageBreak/>
+        <w:t>References</w:t>
+      </w:r>
     </w:p>
     <w:p>
       <w:pPr>
@@ -6059,27 +6023,6 @@
 </file>
 
 <file path=customXml/item1.xml><?xml version="1.0" encoding="utf-8"?>
-<?mso-contentType ?>
-<FormTemplates xmlns="http://schemas.microsoft.com/sharepoint/v3/contenttype/forms">
-  <Display>DocumentLibraryForm</Display>
-  <Edit>DocumentLibraryForm</Edit>
-  <New>DocumentLibraryForm</New>
-</FormTemplates>
-</file>
-
-<file path=customXml/item2.xml><?xml version="1.0" encoding="utf-8"?>
-<p:properties xmlns:p="http://schemas.microsoft.com/office/2006/metadata/properties" xmlns:xsi="http://www.w3.org/2001/XMLSchema-instance" xmlns:pc="http://schemas.microsoft.com/office/infopath/2007/PartnerControls">
-  <documentManagement>
-    <_activity xmlns="c57ade9b-2b41-46b9-81cf-5717af940de2" xsi:nil="true"/>
-  </documentManagement>
-</p:properties>
-</file>
-
-<file path=customXml/item3.xml><?xml version="1.0" encoding="utf-8"?>
-<b:Sources xmlns:b="http://schemas.openxmlformats.org/officeDocument/2006/bibliography" xmlns="http://schemas.openxmlformats.org/officeDocument/2006/bibliography" SelectedStyle="\APASixthEditionOfficeOnline.xsl" StyleName="APA" Version="6"/>
-</file>
-
-<file path=customXml/item4.xml><?xml version="1.0" encoding="utf-8"?>
 <ct:contentTypeSchema xmlns:ct="http://schemas.microsoft.com/office/2006/metadata/contentType" xmlns:ma="http://schemas.microsoft.com/office/2006/metadata/properties/metaAttributes" ct:_="" ma:_="" ma:contentTypeName="Document" ma:contentTypeID="0x010100B0A63D376A9579479CC449175F1E42AB" ma:contentTypeVersion="15" ma:contentTypeDescription="Create a new document." ma:contentTypeScope="" ma:versionID="1d2cfaaa59a60d5bf8d6e83a265b5c9c">
   <xsd:schema xmlns:xsd="http://www.w3.org/2001/XMLSchema" xmlns:xs="http://www.w3.org/2001/XMLSchema" xmlns:p="http://schemas.microsoft.com/office/2006/metadata/properties" xmlns:ns3="c57ade9b-2b41-46b9-81cf-5717af940de2" xmlns:ns4="45eb3245-0457-46d8-85ee-3de4b4a3c69e" targetNamespace="http://schemas.microsoft.com/office/2006/metadata/properties" ma:root="true" ma:fieldsID="7c103fe9197e883231c09ee450232246" ns3:_="" ns4:_="">
     <xsd:import namespace="c57ade9b-2b41-46b9-81cf-5717af940de2"/>
@@ -6312,33 +6255,28 @@
 </ct:contentTypeSchema>
 </file>
 
-<file path=customXml/itemProps1.xml><?xml version="1.0" encoding="utf-8"?>
-<ds:datastoreItem xmlns:ds="http://schemas.openxmlformats.org/officeDocument/2006/customXml" ds:itemID="{11487517-9031-467C-8FCE-029A07CAC644}">
-  <ds:schemaRefs>
-    <ds:schemaRef ds:uri="http://schemas.microsoft.com/sharepoint/v3/contenttype/forms"/>
-  </ds:schemaRefs>
-</ds:datastoreItem>
+<file path=customXml/item2.xml><?xml version="1.0" encoding="utf-8"?>
+<b:Sources xmlns:b="http://schemas.openxmlformats.org/officeDocument/2006/bibliography" xmlns="http://schemas.openxmlformats.org/officeDocument/2006/bibliography" SelectedStyle="\APASixthEditionOfficeOnline.xsl" StyleName="APA" Version="6"/>
 </file>
 
-<file path=customXml/itemProps2.xml><?xml version="1.0" encoding="utf-8"?>
-<ds:datastoreItem xmlns:ds="http://schemas.openxmlformats.org/officeDocument/2006/customXml" ds:itemID="{88990D6C-02CD-4D63-8CFE-C882C60B4273}">
-  <ds:schemaRefs>
-    <ds:schemaRef ds:uri="http://schemas.microsoft.com/office/2006/metadata/properties"/>
-    <ds:schemaRef ds:uri="http://schemas.microsoft.com/office/infopath/2007/PartnerControls"/>
-    <ds:schemaRef ds:uri="c57ade9b-2b41-46b9-81cf-5717af940de2"/>
-  </ds:schemaRefs>
-</ds:datastoreItem>
+<file path=customXml/item3.xml><?xml version="1.0" encoding="utf-8"?>
+<p:properties xmlns:p="http://schemas.microsoft.com/office/2006/metadata/properties" xmlns:xsi="http://www.w3.org/2001/XMLSchema-instance" xmlns:pc="http://schemas.microsoft.com/office/infopath/2007/PartnerControls">
+  <documentManagement>
+    <_activity xmlns="c57ade9b-2b41-46b9-81cf-5717af940de2" xsi:nil="true"/>
+  </documentManagement>
+</p:properties>
 </file>
 
-<file path=customXml/itemProps3.xml><?xml version="1.0" encoding="utf-8"?>
-<ds:datastoreItem xmlns:ds="http://schemas.openxmlformats.org/officeDocument/2006/customXml" ds:itemID="{08DBEA5B-6C2B-4E1B-B9A0-6D1C69A1B971}">
-  <ds:schemaRefs>
-    <ds:schemaRef ds:uri="http://schemas.openxmlformats.org/officeDocument/2006/bibliography"/>
-  </ds:schemaRefs>
-</ds:datastoreItem>
+<file path=customXml/item4.xml><?xml version="1.0" encoding="utf-8"?>
+<?mso-contentType ?>
+<FormTemplates xmlns="http://schemas.microsoft.com/sharepoint/v3/contenttype/forms">
+  <Display>DocumentLibraryForm</Display>
+  <Edit>DocumentLibraryForm</Edit>
+  <New>DocumentLibraryForm</New>
+</FormTemplates>
 </file>
 
-<file path=customXml/itemProps4.xml><?xml version="1.0" encoding="utf-8"?>
+<file path=customXml/itemProps1.xml><?xml version="1.0" encoding="utf-8"?>
 <ds:datastoreItem xmlns:ds="http://schemas.openxmlformats.org/officeDocument/2006/customXml" ds:itemID="{BE3E718A-9A75-4DEC-81C1-27B904AAC839}">
   <ds:schemaRefs>
     <ds:schemaRef ds:uri="http://schemas.microsoft.com/office/2006/metadata/contentType"/>
@@ -6355,4 +6293,30 @@
     <ds:schemaRef ds:uri="http://schemas.microsoft.com/internal/obd"/>
   </ds:schemaRefs>
 </ds:datastoreItem>
+</file>
+
+<file path=customXml/itemProps2.xml><?xml version="1.0" encoding="utf-8"?>
+<ds:datastoreItem xmlns:ds="http://schemas.openxmlformats.org/officeDocument/2006/customXml" ds:itemID="{08DBEA5B-6C2B-4E1B-B9A0-6D1C69A1B971}">
+  <ds:schemaRefs>
+    <ds:schemaRef ds:uri="http://schemas.openxmlformats.org/officeDocument/2006/bibliography"/>
+  </ds:schemaRefs>
+</ds:datastoreItem>
+</file>
+
+<file path=customXml/itemProps3.xml><?xml version="1.0" encoding="utf-8"?>
+<ds:datastoreItem xmlns:ds="http://schemas.openxmlformats.org/officeDocument/2006/customXml" ds:itemID="{88990D6C-02CD-4D63-8CFE-C882C60B4273}">
+  <ds:schemaRefs>
+    <ds:schemaRef ds:uri="http://schemas.microsoft.com/office/2006/metadata/properties"/>
+    <ds:schemaRef ds:uri="http://schemas.microsoft.com/office/infopath/2007/PartnerControls"/>
+    <ds:schemaRef ds:uri="c57ade9b-2b41-46b9-81cf-5717af940de2"/>
+  </ds:schemaRefs>
+</ds:datastoreItem>
+</file>
+
+<file path=customXml/itemProps4.xml><?xml version="1.0" encoding="utf-8"?>
+<ds:datastoreItem xmlns:ds="http://schemas.openxmlformats.org/officeDocument/2006/customXml" ds:itemID="{11487517-9031-467C-8FCE-029A07CAC644}">
+  <ds:schemaRefs>
+    <ds:schemaRef ds:uri="http://schemas.microsoft.com/sharepoint/v3/contenttype/forms"/>
+  </ds:schemaRefs>
+</ds:datastoreItem>
 </file>
</xml_diff>